<commit_message>
2627K1T5.24.543.Văn Nam - giới thiệu bản thân
</commit_message>
<xml_diff>
--- a/2627K1T5.24.543.Văn Nam - Giới Thiệu Bản Thân.docx
+++ b/2627K1T5.24.543.Văn Nam - Giới Thiệu Bản Thân.docx
@@ -120,21 +120,6 @@
       </w:r>
       <w:r>
         <w:t xml:space="preserve"> đam mê học hỏi và phát triển các ứng dụng công nghệ.</w:t>
-      </w:r>
-    </w:p>
-    <w:p>
-      <w:pPr>
-        <w:rPr>
-          <w:b/>
-          <w:bCs/>
-        </w:rPr>
-      </w:pPr>
-      <w:r>
-        <w:rPr>
-          <w:b/>
-          <w:bCs/>
-        </w:rPr>
-        <w:t>Về Tôi</w:t>
       </w:r>
     </w:p>
     <w:p>
@@ -356,7 +341,6 @@
           <w:b/>
           <w:bCs/>
         </w:rPr>
-        <w:lastRenderedPageBreak/>
         <w:t>Dự Án Chính</w:t>
       </w:r>
     </w:p>
@@ -378,6 +362,7 @@
           <w:b/>
           <w:bCs/>
         </w:rPr>
+        <w:lastRenderedPageBreak/>
         <w:t>Clinic Management System</w:t>
       </w:r>
     </w:p>
@@ -2646,6 +2631,7 @@
   <w:style w:type="character" w:default="1" w:styleId="DefaultParagraphFont">
     <w:name w:val="Default Paragraph Font"/>
     <w:uiPriority w:val="1"/>
+    <w:semiHidden/>
     <w:unhideWhenUsed/>
   </w:style>
   <w:style w:type="table" w:default="1" w:styleId="TableNormal">

</xml_diff>